<commit_message>
Update: Added new features/fixes
</commit_message>
<xml_diff>
--- a/Report-Pakistan Energy Access Household Panel Survey using PySpark.docx
+++ b/Report-Pakistan Energy Access Household Panel Survey using PySpark.docx
@@ -2,6 +2,73 @@
 <file path=word/document.xml><?xml version="1.0" encoding="utf-8"?>
 <w:document xmlns:wpc="http://schemas.microsoft.com/office/word/2010/wordprocessingCanvas" xmlns:mc="http://schemas.openxmlformats.org/markup-compatibility/2006" xmlns:o="urn:schemas-microsoft-com:office:office" xmlns:r="http://schemas.openxmlformats.org/officeDocument/2006/relationships" xmlns:m="http://schemas.openxmlformats.org/officeDocument/2006/math" xmlns:v="urn:schemas-microsoft-com:vml" xmlns:wp14="http://schemas.microsoft.com/office/word/2010/wordprocessingDrawing" xmlns:wp="http://schemas.openxmlformats.org/drawingml/2006/wordprocessingDrawing" xmlns:w="http://schemas.openxmlformats.org/wordprocessingml/2006/main" xmlns:w14="http://schemas.microsoft.com/office/word/2010/wordml" xmlns:w10="urn:schemas-microsoft-com:office:word" xmlns:w15="http://schemas.microsoft.com/office/word/2012/wordml" xmlns:wpg="http://schemas.microsoft.com/office/word/2010/wordprocessingGroup" xmlns:wpi="http://schemas.microsoft.com/office/word/2010/wordprocessingInk" xmlns:wne="http://schemas.microsoft.com/office/word/2006/wordml" xmlns:wps="http://schemas.microsoft.com/office/word/2010/wordprocessingShape" xmlns:wpsCustomData="http://www.wps.cn/officeDocument/2013/wpsCustomData" mc:Ignorable="w14 w15 wp14">
   <w:body>
+    <w:p>
+      <w:pPr>
+        <w:spacing w:after="80"/>
+        <w:jc w:val="center"/>
+        <w:rPr>
+          <w:b/>
+          <w:bCs/>
+          <w:color w:val="FFFFFF"/>
+          <w:sz w:val="52"/>
+          <w:szCs w:val="52"/>
+        </w:rPr>
+      </w:pPr>
+    </w:p>
+    <w:p>
+      <w:pPr>
+        <w:spacing w:after="80"/>
+        <w:jc w:val="center"/>
+        <w:rPr>
+          <w:b/>
+          <w:bCs/>
+          <w:color w:val="FFFFFF"/>
+          <w:sz w:val="52"/>
+          <w:szCs w:val="52"/>
+        </w:rPr>
+      </w:pPr>
+      <w:bookmarkStart w:id="0" w:name="_GoBack"/>
+      <w:bookmarkEnd w:id="0"/>
+    </w:p>
+    <w:p>
+      <w:pPr>
+        <w:spacing w:after="80"/>
+        <w:jc w:val="center"/>
+        <w:rPr>
+          <w:b/>
+          <w:bCs/>
+          <w:color w:val="FFFFFF"/>
+          <w:sz w:val="52"/>
+          <w:szCs w:val="52"/>
+        </w:rPr>
+      </w:pPr>
+    </w:p>
+    <w:p>
+      <w:pPr>
+        <w:spacing w:after="80"/>
+        <w:jc w:val="center"/>
+        <w:rPr>
+          <w:b/>
+          <w:bCs/>
+          <w:color w:val="FFFFFF"/>
+          <w:sz w:val="52"/>
+          <w:szCs w:val="52"/>
+        </w:rPr>
+      </w:pPr>
+    </w:p>
+    <w:p>
+      <w:pPr>
+        <w:spacing w:after="80"/>
+        <w:jc w:val="center"/>
+        <w:rPr>
+          <w:b/>
+          <w:bCs/>
+          <w:color w:val="FFFFFF"/>
+          <w:sz w:val="52"/>
+          <w:szCs w:val="52"/>
+        </w:rPr>
+      </w:pPr>
+    </w:p>
     <w:tbl>
       <w:tblPr>
         <w:tblStyle w:val="9"/>
@@ -36,12 +103,6 @@
             <w:insideH w:val="single" w:color="auto" w:sz="4" w:space="0"/>
             <w:insideV w:val="single" w:color="auto" w:sz="4" w:space="0"/>
           </w:tblBorders>
-          <w:tblCellMar>
-            <w:top w:w="0" w:type="dxa"/>
-            <w:left w:w="10" w:type="dxa"/>
-            <w:bottom w:w="0" w:type="dxa"/>
-            <w:right w:w="10" w:type="dxa"/>
-          </w:tblCellMar>
         </w:tblPrEx>
         <w:trPr>
           <w:jc w:val="center"/>
@@ -66,7 +127,8 @@
           <w:p>
             <w:pPr>
               <w:spacing w:after="80"/>
-              <w:jc w:val="center"/>
+              <w:ind w:firstLine="1821" w:firstLineChars="350"/>
+              <w:jc w:val="both"/>
             </w:pPr>
             <w:r>
               <w:rPr>
@@ -198,14 +260,6 @@
       </w:tblGrid>
       <w:tr>
         <w:tblPrEx>
-          <w:tblBorders>
-            <w:top w:val="single" w:color="auto" w:sz="4" w:space="0"/>
-            <w:left w:val="single" w:color="auto" w:sz="4" w:space="0"/>
-            <w:bottom w:val="single" w:color="auto" w:sz="4" w:space="0"/>
-            <w:right w:val="single" w:color="auto" w:sz="4" w:space="0"/>
-            <w:insideH w:val="single" w:color="auto" w:sz="4" w:space="0"/>
-            <w:insideV w:val="single" w:color="auto" w:sz="4" w:space="0"/>
-          </w:tblBorders>
           <w:tblCellMar>
             <w:top w:w="0" w:type="dxa"/>
             <w:left w:w="10" w:type="dxa"/>
@@ -611,6 +665,11 @@
       <w:pPr>
         <w:pStyle w:val="2"/>
       </w:pPr>
+    </w:p>
+    <w:p>
+      <w:pPr>
+        <w:pStyle w:val="2"/>
+      </w:pPr>
       <w:r>
         <w:t>1. Introduction</w:t>
       </w:r>
@@ -652,6 +711,7 @@
           <w:numId w:val="1"/>
         </w:numPr>
         <w:spacing w:before="40" w:after="40"/>
+        <w:jc w:val="both"/>
       </w:pPr>
       <w:r>
         <w:t>Survey datasets are large and messy, containing missing values, inconsistent categories, and mixed data types.</w:t>
@@ -665,6 +725,7 @@
           <w:numId w:val="1"/>
         </w:numPr>
         <w:spacing w:before="40" w:after="40"/>
+        <w:jc w:val="both"/>
       </w:pPr>
       <w:r>
         <w:t>Scalable processing frameworks such as Apache Spark are required for efficient computation.</w:t>
@@ -678,6 +739,7 @@
           <w:numId w:val="1"/>
         </w:numPr>
         <w:spacing w:before="40" w:after="40"/>
+        <w:jc w:val="both"/>
       </w:pPr>
       <w:r>
         <w:t>Result correctness must be validated across multiple query interfaces (SQL vs. DataFrame).</w:t>
@@ -691,6 +753,7 @@
           <w:numId w:val="1"/>
         </w:numPr>
         <w:spacing w:before="40" w:after="40"/>
+        <w:jc w:val="both"/>
       </w:pPr>
       <w:r>
         <w:t>Meaningful analytics depend on clean, filtered data and informative visual representations.</w:t>
@@ -699,6 +762,7 @@
     <w:p>
       <w:pPr>
         <w:spacing w:before="120" w:after="120"/>
+        <w:jc w:val="both"/>
       </w:pPr>
     </w:p>
     <w:p>
@@ -1374,6 +1438,18 @@
       </w:tr>
     </w:tbl>
     <w:p/>
+    <w:p/>
+    <w:p/>
+    <w:p/>
+    <w:p/>
+    <w:p/>
+    <w:p/>
+    <w:p/>
+    <w:p/>
+    <w:p/>
+    <w:p/>
+    <w:p/>
+    <w:p/>
     <w:p>
       <w:pPr>
         <w:jc w:val="center"/>
@@ -1383,14 +1459,6 @@
           <w:szCs w:val="24"/>
         </w:rPr>
       </w:pPr>
-      <w:r>
-        <w:rPr>
-          <w:rFonts w:ascii="Calibri" w:hAnsi="Calibri" w:eastAsia="Calibri" w:cs="Calibri"/>
-          <w:sz w:val="24"/>
-          <w:szCs w:val="24"/>
-        </w:rPr>
-        <w:t>e</w:t>
-      </w:r>
       <w:r>
         <w:rPr>
           <w:rFonts w:ascii="Calibri" w:hAnsi="Calibri" w:eastAsia="Calibri" w:cs="Calibri"/>
@@ -1441,6 +1509,16 @@
     <w:p>
       <w:pPr>
         <w:jc w:val="center"/>
+        <w:rPr>
+          <w:rFonts w:ascii="Calibri" w:hAnsi="Calibri" w:eastAsia="Calibri" w:cs="Calibri"/>
+          <w:sz w:val="24"/>
+          <w:szCs w:val="24"/>
+        </w:rPr>
+      </w:pPr>
+    </w:p>
+    <w:p>
+      <w:pPr>
+        <w:jc w:val="center"/>
       </w:pPr>
       <w:r>
         <w:rPr>
@@ -1498,6 +1576,11 @@
       <w:pPr>
         <w:pStyle w:val="2"/>
       </w:pPr>
+    </w:p>
+    <w:p>
+      <w:pPr>
+        <w:pStyle w:val="2"/>
+      </w:pPr>
       <w:r>
         <w:t>3. Tools &amp; Technologies</w:t>
       </w:r>
@@ -1685,6 +1768,12 @@
         <w:br w:type="page"/>
       </w:r>
     </w:p>
+    <w:p/>
+    <w:p>
+      <w:pPr>
+        <w:pStyle w:val="2"/>
+      </w:pPr>
+    </w:p>
     <w:p>
       <w:pPr>
         <w:pStyle w:val="2"/>
@@ -1730,6 +1819,7 @@
           <w:numId w:val="2"/>
         </w:numPr>
         <w:spacing w:before="40" w:after="40"/>
+        <w:jc w:val="both"/>
       </w:pPr>
       <w:r>
         <w:t>Extract — Load the raw CSV into a Spark DataFrame.</w:t>
@@ -1743,6 +1833,7 @@
           <w:numId w:val="2"/>
         </w:numPr>
         <w:spacing w:before="40" w:after="40"/>
+        <w:jc w:val="both"/>
       </w:pPr>
       <w:r>
         <w:t>Transform — Standardize categories, safely cast numeric fields, derive connection_status, and filter invalid rows (null, empty, or UNKNOWN values).</w:t>
@@ -1756,6 +1847,7 @@
           <w:numId w:val="2"/>
         </w:numPr>
         <w:spacing w:before="40" w:after="40"/>
+        <w:jc w:val="both"/>
       </w:pPr>
       <w:r>
         <w:t>Load — Export core aggregations (region counts) as CSV and JSONL files.</w:t>
@@ -1769,6 +1861,7 @@
           <w:numId w:val="2"/>
         </w:numPr>
         <w:spacing w:before="40" w:after="40"/>
+        <w:jc w:val="both"/>
       </w:pPr>
       <w:r>
         <w:t>Validate — Compare DataFrame aggregations against equivalent Spark SQL aggregations.</w:t>
@@ -1782,6 +1875,7 @@
           <w:numId w:val="2"/>
         </w:numPr>
         <w:spacing w:before="40" w:after="40"/>
+        <w:jc w:val="both"/>
       </w:pPr>
       <w:r>
         <w:t>Analyze — Produce multiple unique analytical plots across key dimensions.</w:t>
@@ -1795,6 +1889,7 @@
           <w:numId w:val="2"/>
         </w:numPr>
         <w:spacing w:before="40" w:after="40"/>
+        <w:jc w:val="both"/>
       </w:pPr>
       <w:r>
         <w:t>Benchmark — Measure and compare execution time: Spark SQL, Spark DataFrame, and pure Python.</w:t>
@@ -1803,6 +1898,7 @@
     <w:p>
       <w:pPr>
         <w:spacing w:before="120" w:after="120"/>
+        <w:jc w:val="both"/>
       </w:pPr>
     </w:p>
     <w:p>
@@ -1871,6 +1967,7 @@
           <w:numId w:val="1"/>
         </w:numPr>
         <w:spacing w:before="40" w:after="40"/>
+        <w:jc w:val="both"/>
       </w:pPr>
       <w:r>
         <w:t>Map — withColumn and when/otherwise logic maps raw connectivity codes (1 or 2) to readable labels ("Connected" / "Not Connected"). This mapping function is applied to every row.</w:t>
@@ -1884,6 +1981,7 @@
           <w:numId w:val="1"/>
         </w:numPr>
         <w:spacing w:before="40" w:after="40"/>
+        <w:jc w:val="both"/>
       </w:pPr>
       <w:r>
         <w:t>Filter — .filter() removes rows where labels are empty, null, or "UNKNOWN", ensuring only high-quality data enters the analytics stage.</w:t>
@@ -1897,6 +1995,7 @@
           <w:numId w:val="1"/>
         </w:numPr>
         <w:spacing w:before="40" w:after="40"/>
+        <w:jc w:val="both"/>
       </w:pPr>
       <w:r>
         <w:t>GroupBy — .groupBy("region") or .groupBy("connection_status") groups related rows for aggregation.</w:t>
@@ -1910,6 +2009,7 @@
           <w:numId w:val="1"/>
         </w:numPr>
         <w:spacing w:before="40" w:after="40"/>
+        <w:jc w:val="both"/>
       </w:pPr>
       <w:r>
         <w:t>Reduce — .count() or .agg(F.sum(...)) collapses groups into single numerical results (e.g., total count per region).</w:t>
@@ -2009,6 +2109,16 @@
     <w:p>
       <w:pPr>
         <w:spacing w:before="100" w:after="40"/>
+        <w:rPr>
+          <w:b/>
+          <w:bCs/>
+          <w:color w:val="2E5D9E"/>
+        </w:rPr>
+      </w:pPr>
+    </w:p>
+    <w:p>
+      <w:pPr>
+        <w:spacing w:before="100" w:after="40"/>
       </w:pPr>
       <w:r>
         <w:rPr>
@@ -2139,611 +2249,6 @@
     <w:p/>
     <w:p>
       <w:pPr>
-        <w:pStyle w:val="2"/>
-      </w:pPr>
-      <w:r>
-        <w:t>5. Visual Analytics</w:t>
-      </w:r>
-    </w:p>
-    <w:p>
-      <w:pPr>
-        <w:pBdr>
-          <w:bottom w:val="single" w:color="2E75B6" w:sz="6" w:space="1"/>
-        </w:pBdr>
-      </w:pPr>
-    </w:p>
-    <w:p>
-      <w:pPr>
-        <w:spacing w:before="60" w:after="60"/>
-      </w:pPr>
-    </w:p>
-    <w:p>
-      <w:pPr>
-        <w:spacing w:before="60" w:after="60"/>
-        <w:jc w:val="both"/>
-      </w:pPr>
-      <w:r>
-        <w:t>Six unique analytical visualizations were produced, each derived from validated, filtered data. The table below summarizes the graphs and their key insights:</w:t>
-      </w:r>
-    </w:p>
-    <w:p>
-      <w:pPr>
-        <w:spacing w:before="80" w:after="80"/>
-      </w:pPr>
-    </w:p>
-    <w:p>
-      <w:pPr>
-        <w:spacing w:before="100" w:after="40"/>
-        <w:rPr>
-          <w:rFonts w:ascii="Calibri" w:hAnsi="Calibri" w:eastAsia="Calibri"/>
-          <w:b/>
-          <w:bCs/>
-          <w:sz w:val="24"/>
-          <w:szCs w:val="24"/>
-        </w:rPr>
-      </w:pPr>
-      <w:r>
-        <w:rPr>
-          <w:b/>
-          <w:bCs/>
-          <w:color w:val="2E5D9E"/>
-        </w:rPr>
-        <w:t>Graph 1: Top Region Connected</w:t>
-      </w:r>
-    </w:p>
-    <w:p>
-      <w:pPr>
-        <w:jc w:val="center"/>
-      </w:pPr>
-      <w:r>
-        <w:drawing>
-          <wp:inline distT="0" distB="0" distL="114300" distR="114300">
-            <wp:extent cx="4817745" cy="2642235"/>
-            <wp:effectExtent l="0" t="0" r="1905" b="5715"/>
-            <wp:docPr id="25" name="Picture 2"/>
-            <wp:cNvGraphicFramePr>
-              <a:graphicFrameLocks xmlns:a="http://schemas.openxmlformats.org/drawingml/2006/main" noChangeAspect="1"/>
-            </wp:cNvGraphicFramePr>
-            <a:graphic xmlns:a="http://schemas.openxmlformats.org/drawingml/2006/main">
-              <a:graphicData uri="http://schemas.openxmlformats.org/drawingml/2006/picture">
-                <pic:pic xmlns:pic="http://schemas.openxmlformats.org/drawingml/2006/picture">
-                  <pic:nvPicPr>
-                    <pic:cNvPr id="25" name="Picture 2"/>
-                    <pic:cNvPicPr>
-                      <a:picLocks noChangeAspect="1"/>
-                    </pic:cNvPicPr>
-                  </pic:nvPicPr>
-                  <pic:blipFill>
-                    <a:blip r:embed="rId9"/>
-                    <a:stretch>
-                      <a:fillRect/>
-                    </a:stretch>
-                  </pic:blipFill>
-                  <pic:spPr>
-                    <a:xfrm>
-                      <a:off x="0" y="0"/>
-                      <a:ext cx="4817745" cy="2642235"/>
-                    </a:xfrm>
-                    <a:prstGeom prst="rect">
-                      <a:avLst/>
-                    </a:prstGeom>
-                    <a:noFill/>
-                    <a:ln>
-                      <a:noFill/>
-                    </a:ln>
-                  </pic:spPr>
-                </pic:pic>
-              </a:graphicData>
-            </a:graphic>
-          </wp:inline>
-        </w:drawing>
-      </w:r>
-    </w:p>
-    <w:p>
-      <w:pPr>
-        <w:jc w:val="both"/>
-        <w:rPr>
-          <w:rFonts w:eastAsia="Calibri"/>
-          <w:szCs w:val="24"/>
-        </w:rPr>
-      </w:pPr>
-    </w:p>
-    <w:p>
-      <w:pPr>
-        <w:jc w:val="both"/>
-        <w:rPr>
-          <w:rFonts w:eastAsia="Calibri"/>
-          <w:szCs w:val="24"/>
-        </w:rPr>
-      </w:pPr>
-      <w:r>
-        <w:rPr>
-          <w:rFonts w:eastAsia="Calibri"/>
-          <w:szCs w:val="24"/>
-        </w:rPr>
-        <w:t>This horizontal bar chart shows the total count of connected households per region.</w:t>
-      </w:r>
-    </w:p>
-    <w:p>
-      <w:pPr>
-        <w:jc w:val="both"/>
-        <w:rPr>
-          <w:rFonts w:eastAsia="Calibri"/>
-          <w:szCs w:val="24"/>
-        </w:rPr>
-      </w:pPr>
-      <w:r>
-        <w:rPr>
-          <w:rFonts w:eastAsia="Calibri"/>
-          <w:szCs w:val="24"/>
-        </w:rPr>
-        <w:t xml:space="preserve">- </w:t>
-      </w:r>
-      <w:r>
-        <w:rPr>
-          <w:rFonts w:eastAsia="Calibri"/>
-          <w:b/>
-          <w:bCs/>
-          <w:szCs w:val="24"/>
-        </w:rPr>
-        <w:t>Insights</w:t>
-      </w:r>
-      <w:r>
-        <w:rPr>
-          <w:rFonts w:eastAsia="Calibri"/>
-          <w:szCs w:val="24"/>
-        </w:rPr>
-        <w:t>: It highlights which geographic areas have the strongest presence in the dataset. Because we filtered out "UNKNOWN" regions during the Filter step, the data is accurate and trustworthy.</w:t>
-      </w:r>
-    </w:p>
-    <w:p>
-      <w:pPr>
-        <w:jc w:val="both"/>
-        <w:rPr>
-          <w:rFonts w:ascii="Calibri" w:hAnsi="Calibri" w:eastAsia="Calibri"/>
-          <w:sz w:val="24"/>
-          <w:szCs w:val="24"/>
-        </w:rPr>
-      </w:pPr>
-    </w:p>
-    <w:p>
-      <w:pPr>
-        <w:rPr>
-          <w:b/>
-          <w:bCs/>
-          <w:color w:val="2E5D9E"/>
-        </w:rPr>
-      </w:pPr>
-      <w:r>
-        <w:rPr>
-          <w:b/>
-          <w:bCs/>
-          <w:color w:val="2E5D9E"/>
-        </w:rPr>
-        <w:br w:type="page"/>
-      </w:r>
-    </w:p>
-    <w:p>
-      <w:pPr>
-        <w:jc w:val="both"/>
-        <w:rPr>
-          <w:rFonts w:ascii="Calibri" w:hAnsi="Calibri" w:eastAsia="Calibri"/>
-          <w:b/>
-          <w:bCs/>
-          <w:sz w:val="24"/>
-          <w:szCs w:val="24"/>
-        </w:rPr>
-      </w:pPr>
-      <w:r>
-        <w:rPr>
-          <w:b/>
-          <w:bCs/>
-          <w:color w:val="2E5D9E"/>
-        </w:rPr>
-        <w:t>Graph 2: Overall Connection Status (Pie Chart)</w:t>
-      </w:r>
-    </w:p>
-    <w:p>
-      <w:pPr>
-        <w:jc w:val="both"/>
-        <w:rPr>
-          <w:rFonts w:ascii="Calibri" w:hAnsi="Calibri" w:eastAsia="Calibri"/>
-          <w:b/>
-          <w:bCs/>
-          <w:sz w:val="24"/>
-          <w:szCs w:val="24"/>
-        </w:rPr>
-      </w:pPr>
-    </w:p>
-    <w:p>
-      <w:pPr>
-        <w:jc w:val="center"/>
-        <w:rPr>
-          <w:rFonts w:ascii="Calibri" w:hAnsi="Calibri" w:eastAsia="Calibri"/>
-          <w:b/>
-          <w:bCs/>
-          <w:sz w:val="24"/>
-          <w:szCs w:val="24"/>
-        </w:rPr>
-      </w:pPr>
-      <w:r>
-        <w:drawing>
-          <wp:inline distT="0" distB="0" distL="114300" distR="114300">
-            <wp:extent cx="3111500" cy="2209800"/>
-            <wp:effectExtent l="0" t="0" r="12700" b="0"/>
-            <wp:docPr id="26" name="Picture 3"/>
-            <wp:cNvGraphicFramePr>
-              <a:graphicFrameLocks xmlns:a="http://schemas.openxmlformats.org/drawingml/2006/main" noChangeAspect="1"/>
-            </wp:cNvGraphicFramePr>
-            <a:graphic xmlns:a="http://schemas.openxmlformats.org/drawingml/2006/main">
-              <a:graphicData uri="http://schemas.openxmlformats.org/drawingml/2006/picture">
-                <pic:pic xmlns:pic="http://schemas.openxmlformats.org/drawingml/2006/picture">
-                  <pic:nvPicPr>
-                    <pic:cNvPr id="26" name="Picture 3"/>
-                    <pic:cNvPicPr>
-                      <a:picLocks noChangeAspect="1"/>
-                    </pic:cNvPicPr>
-                  </pic:nvPicPr>
-                  <pic:blipFill>
-                    <a:blip r:embed="rId10"/>
-                    <a:stretch>
-                      <a:fillRect/>
-                    </a:stretch>
-                  </pic:blipFill>
-                  <pic:spPr>
-                    <a:xfrm>
-                      <a:off x="0" y="0"/>
-                      <a:ext cx="3111500" cy="2209800"/>
-                    </a:xfrm>
-                    <a:prstGeom prst="rect">
-                      <a:avLst/>
-                    </a:prstGeom>
-                    <a:noFill/>
-                    <a:ln>
-                      <a:noFill/>
-                    </a:ln>
-                  </pic:spPr>
-                </pic:pic>
-              </a:graphicData>
-            </a:graphic>
-          </wp:inline>
-        </w:drawing>
-      </w:r>
-    </w:p>
-    <w:p>
-      <w:pPr>
-        <w:jc w:val="both"/>
-        <w:rPr>
-          <w:rFonts w:eastAsia="Calibri"/>
-          <w:szCs w:val="24"/>
-        </w:rPr>
-      </w:pPr>
-      <w:r>
-        <w:rPr>
-          <w:rFonts w:eastAsia="Calibri"/>
-          <w:szCs w:val="24"/>
-        </w:rPr>
-        <w:t>This pie chart shows the percentage split between "Connected" and "Not connected" households.</w:t>
-      </w:r>
-    </w:p>
-    <w:p>
-      <w:pPr>
-        <w:jc w:val="both"/>
-        <w:rPr>
-          <w:rFonts w:eastAsia="Calibri"/>
-          <w:szCs w:val="24"/>
-        </w:rPr>
-      </w:pPr>
-      <w:r>
-        <w:rPr>
-          <w:rFonts w:eastAsia="Calibri"/>
-          <w:szCs w:val="24"/>
-        </w:rPr>
-        <w:t xml:space="preserve">- </w:t>
-      </w:r>
-      <w:r>
-        <w:rPr>
-          <w:rFonts w:eastAsia="Calibri"/>
-          <w:b/>
-          <w:bCs/>
-          <w:szCs w:val="24"/>
-        </w:rPr>
-        <w:t>Insights</w:t>
-      </w:r>
-      <w:r>
-        <w:rPr>
-          <w:rFonts w:eastAsia="Calibri"/>
-          <w:szCs w:val="24"/>
-        </w:rPr>
-        <w:t>: It gives a high-level view of the energy access gap. This was driven by a GroupBy on the mapped status labels and a Reduce (count) to get the proportions.</w:t>
-      </w:r>
-    </w:p>
-    <w:p>
-      <w:pPr>
-        <w:jc w:val="both"/>
-        <w:rPr>
-          <w:rFonts w:ascii="Calibri" w:hAnsi="Calibri" w:eastAsia="Calibri"/>
-          <w:sz w:val="24"/>
-          <w:szCs w:val="24"/>
-        </w:rPr>
-      </w:pPr>
-    </w:p>
-    <w:p>
-      <w:pPr>
-        <w:jc w:val="both"/>
-        <w:rPr>
-          <w:rFonts w:ascii="Calibri" w:hAnsi="Calibri" w:eastAsia="Calibri"/>
-          <w:b/>
-          <w:bCs/>
-          <w:sz w:val="24"/>
-          <w:szCs w:val="24"/>
-        </w:rPr>
-      </w:pPr>
-      <w:r>
-        <w:rPr>
-          <w:b/>
-          <w:bCs/>
-          <w:color w:val="2E5D9E"/>
-        </w:rPr>
-        <w:t>Graph 3: Connection by Category (Stacked Bar)</w:t>
-      </w:r>
-    </w:p>
-    <w:p>
-      <w:pPr>
-        <w:jc w:val="both"/>
-        <w:rPr>
-          <w:rFonts w:ascii="Calibri" w:hAnsi="Calibri" w:eastAsia="Calibri"/>
-          <w:b/>
-          <w:bCs/>
-          <w:sz w:val="24"/>
-          <w:szCs w:val="24"/>
-        </w:rPr>
-      </w:pPr>
-    </w:p>
-    <w:p>
-      <w:pPr>
-        <w:jc w:val="center"/>
-        <w:rPr>
-          <w:rFonts w:eastAsia="Calibri"/>
-          <w:sz w:val="24"/>
-          <w:szCs w:val="24"/>
-        </w:rPr>
-      </w:pPr>
-      <w:r>
-        <w:drawing>
-          <wp:inline distT="0" distB="0" distL="114300" distR="114300">
-            <wp:extent cx="5932170" cy="3268980"/>
-            <wp:effectExtent l="0" t="0" r="11430" b="7620"/>
-            <wp:docPr id="27" name="Picture 4"/>
-            <wp:cNvGraphicFramePr>
-              <a:graphicFrameLocks xmlns:a="http://schemas.openxmlformats.org/drawingml/2006/main" noChangeAspect="1"/>
-            </wp:cNvGraphicFramePr>
-            <a:graphic xmlns:a="http://schemas.openxmlformats.org/drawingml/2006/main">
-              <a:graphicData uri="http://schemas.openxmlformats.org/drawingml/2006/picture">
-                <pic:pic xmlns:pic="http://schemas.openxmlformats.org/drawingml/2006/picture">
-                  <pic:nvPicPr>
-                    <pic:cNvPr id="27" name="Picture 4"/>
-                    <pic:cNvPicPr>
-                      <a:picLocks noChangeAspect="1"/>
-                    </pic:cNvPicPr>
-                  </pic:nvPicPr>
-                  <pic:blipFill>
-                    <a:blip r:embed="rId11"/>
-                    <a:stretch>
-                      <a:fillRect/>
-                    </a:stretch>
-                  </pic:blipFill>
-                  <pic:spPr>
-                    <a:xfrm>
-                      <a:off x="0" y="0"/>
-                      <a:ext cx="5932170" cy="3268980"/>
-                    </a:xfrm>
-                    <a:prstGeom prst="rect">
-                      <a:avLst/>
-                    </a:prstGeom>
-                    <a:noFill/>
-                    <a:ln>
-                      <a:noFill/>
-                    </a:ln>
-                  </pic:spPr>
-                </pic:pic>
-              </a:graphicData>
-            </a:graphic>
-          </wp:inline>
-        </w:drawing>
-      </w:r>
-      <w:r>
-        <w:rPr>
-          <w:rFonts w:eastAsia="Calibri"/>
-          <w:sz w:val="24"/>
-          <w:szCs w:val="24"/>
-        </w:rPr>
-        <w:t>Stacked bars showing the proportion of connected vs. unconnected within each group (e.g., SEC A, B, C).</w:t>
-      </w:r>
-    </w:p>
-    <w:p>
-      <w:pPr>
-        <w:jc w:val="both"/>
-        <w:rPr>
-          <w:rFonts w:eastAsia="Calibri"/>
-          <w:sz w:val="24"/>
-          <w:szCs w:val="24"/>
-        </w:rPr>
-      </w:pPr>
-      <w:r>
-        <w:rPr>
-          <w:rFonts w:eastAsia="Calibri"/>
-          <w:sz w:val="24"/>
-          <w:szCs w:val="24"/>
-        </w:rPr>
-        <w:t xml:space="preserve">- </w:t>
-      </w:r>
-      <w:r>
-        <w:rPr>
-          <w:rFonts w:eastAsia="Calibri"/>
-          <w:b/>
-          <w:bCs/>
-          <w:sz w:val="24"/>
-          <w:szCs w:val="24"/>
-        </w:rPr>
-        <w:t>Insights</w:t>
-      </w:r>
-      <w:r>
-        <w:rPr>
-          <w:rFonts w:eastAsia="Calibri"/>
-          <w:sz w:val="24"/>
-          <w:szCs w:val="24"/>
-        </w:rPr>
-        <w:t>: This is a complex ETL result involving GroupBy on two columns (Category + Status) followed by a Reduce count. It reveals if certain demographics (like specific SEC groups or genders) have unequal access to the grid.</w:t>
-      </w:r>
-    </w:p>
-    <w:p>
-      <w:pPr>
-        <w:jc w:val="both"/>
-        <w:rPr>
-          <w:rFonts w:ascii="Calibri" w:hAnsi="Calibri" w:eastAsia="Calibri"/>
-          <w:sz w:val="24"/>
-          <w:szCs w:val="24"/>
-        </w:rPr>
-      </w:pPr>
-    </w:p>
-    <w:p>
-      <w:pPr>
-        <w:jc w:val="both"/>
-        <w:rPr>
-          <w:rFonts w:ascii="Calibri" w:hAnsi="Calibri" w:eastAsia="Calibri"/>
-          <w:b/>
-          <w:bCs/>
-          <w:sz w:val="24"/>
-          <w:szCs w:val="24"/>
-        </w:rPr>
-      </w:pPr>
-      <w:r>
-        <w:rPr>
-          <w:b/>
-          <w:bCs/>
-          <w:color w:val="2E5D9E"/>
-        </w:rPr>
-        <w:t>Graph 4: Distance Distribution (Histogram)</w:t>
-      </w:r>
-    </w:p>
-    <w:p>
-      <w:pPr>
-        <w:jc w:val="both"/>
-        <w:rPr>
-          <w:rFonts w:ascii="Calibri" w:hAnsi="Calibri" w:eastAsia="Calibri"/>
-          <w:b/>
-          <w:bCs/>
-          <w:sz w:val="24"/>
-          <w:szCs w:val="24"/>
-        </w:rPr>
-      </w:pPr>
-    </w:p>
-    <w:p>
-      <w:pPr>
-        <w:jc w:val="both"/>
-        <w:rPr>
-          <w:rFonts w:ascii="Calibri" w:hAnsi="Calibri" w:eastAsia="Calibri"/>
-          <w:sz w:val="24"/>
-          <w:szCs w:val="24"/>
-        </w:rPr>
-      </w:pPr>
-    </w:p>
-    <w:p>
-      <w:pPr>
-        <w:jc w:val="center"/>
-        <w:rPr>
-          <w:rFonts w:ascii="Calibri" w:hAnsi="Calibri" w:eastAsia="Calibri"/>
-          <w:sz w:val="24"/>
-          <w:szCs w:val="24"/>
-        </w:rPr>
-      </w:pPr>
-      <w:r>
-        <w:drawing>
-          <wp:inline distT="0" distB="0" distL="114300" distR="114300">
-            <wp:extent cx="5932170" cy="3268980"/>
-            <wp:effectExtent l="0" t="0" r="11430" b="7620"/>
-            <wp:docPr id="28" name="Picture 5"/>
-            <wp:cNvGraphicFramePr>
-              <a:graphicFrameLocks xmlns:a="http://schemas.openxmlformats.org/drawingml/2006/main" noChangeAspect="1"/>
-            </wp:cNvGraphicFramePr>
-            <a:graphic xmlns:a="http://schemas.openxmlformats.org/drawingml/2006/main">
-              <a:graphicData uri="http://schemas.openxmlformats.org/drawingml/2006/picture">
-                <pic:pic xmlns:pic="http://schemas.openxmlformats.org/drawingml/2006/picture">
-                  <pic:nvPicPr>
-                    <pic:cNvPr id="28" name="Picture 5"/>
-                    <pic:cNvPicPr>
-                      <a:picLocks noChangeAspect="1"/>
-                    </pic:cNvPicPr>
-                  </pic:nvPicPr>
-                  <pic:blipFill>
-                    <a:blip r:embed="rId11"/>
-                    <a:stretch>
-                      <a:fillRect/>
-                    </a:stretch>
-                  </pic:blipFill>
-                  <pic:spPr>
-                    <a:xfrm>
-                      <a:off x="0" y="0"/>
-                      <a:ext cx="5932170" cy="3268980"/>
-                    </a:xfrm>
-                    <a:prstGeom prst="rect">
-                      <a:avLst/>
-                    </a:prstGeom>
-                    <a:noFill/>
-                    <a:ln>
-                      <a:noFill/>
-                    </a:ln>
-                  </pic:spPr>
-                </pic:pic>
-              </a:graphicData>
-            </a:graphic>
-          </wp:inline>
-        </w:drawing>
-      </w:r>
-    </w:p>
-    <w:p>
-      <w:pPr>
-        <w:jc w:val="both"/>
-        <w:rPr>
-          <w:rFonts w:eastAsia="Calibri"/>
-          <w:szCs w:val="24"/>
-        </w:rPr>
-      </w:pPr>
-      <w:r>
-        <w:rPr>
-          <w:rFonts w:ascii="Calibri" w:hAnsi="Calibri" w:eastAsia="Calibri"/>
-          <w:sz w:val="24"/>
-          <w:szCs w:val="24"/>
-        </w:rPr>
-        <w:t xml:space="preserve">A </w:t>
-      </w:r>
-      <w:r>
-        <w:rPr>
-          <w:rFonts w:eastAsia="Calibri"/>
-          <w:szCs w:val="24"/>
-        </w:rPr>
-        <w:t>histogram of the "Distance to Grid" numeric field.</w:t>
-      </w:r>
-    </w:p>
-    <w:p>
-      <w:pPr>
-        <w:jc w:val="both"/>
-        <w:rPr>
-          <w:rFonts w:eastAsia="Calibri"/>
-          <w:szCs w:val="24"/>
-        </w:rPr>
-      </w:pPr>
-      <w:r>
-        <w:rPr>
-          <w:rFonts w:eastAsia="Calibri"/>
-          <w:szCs w:val="24"/>
-        </w:rPr>
-        <w:t xml:space="preserve">- Insights: Shows how far "off-grid" households typically are. This used a Filter to remove non-numeric/null values before sampling. </w:t>
-      </w:r>
-    </w:p>
-    <w:p>
-      <w:pPr>
         <w:jc w:val="both"/>
         <w:rPr>
           <w:rFonts w:ascii="Calibri" w:hAnsi="Calibri" w:eastAsia="Calibri" w:cs="Calibri"/>
@@ -2978,541 +2483,20 @@
         <w:spacing w:before="80" w:after="80"/>
       </w:pPr>
     </w:p>
-    <w:p>
-      <w:pPr>
-        <w:rPr>
-          <w:b/>
-          <w:bCs/>
-          <w:color w:val="2E5D9E"/>
-        </w:rPr>
-      </w:pPr>
-      <w:r>
-        <w:rPr>
-          <w:b/>
-          <w:bCs/>
-          <w:color w:val="2E5D9E"/>
-        </w:rPr>
-        <w:br w:type="page"/>
-      </w:r>
-    </w:p>
-    <w:p>
-      <w:pPr>
-        <w:jc w:val="both"/>
-        <w:rPr>
-          <w:rFonts w:ascii="Calibri" w:hAnsi="Calibri" w:eastAsia="Calibri" w:cs="Calibri"/>
-          <w:b/>
-          <w:bCs/>
-          <w:sz w:val="32"/>
-          <w:szCs w:val="32"/>
-        </w:rPr>
-      </w:pPr>
-      <w:r>
-        <w:rPr>
-          <w:b/>
-          <w:bCs/>
-          <w:color w:val="2E5D9E"/>
-        </w:rPr>
-        <w:t>Graph 5: Numeric Distribution Analysis</w:t>
-      </w:r>
-    </w:p>
-    <w:p>
-      <w:pPr>
-        <w:jc w:val="both"/>
-        <w:rPr>
-          <w:rFonts w:ascii="Calibri" w:hAnsi="Calibri" w:eastAsia="Calibri" w:cs="Calibri"/>
-          <w:b/>
-          <w:bCs/>
-          <w:sz w:val="32"/>
-          <w:szCs w:val="32"/>
-        </w:rPr>
-      </w:pPr>
-    </w:p>
-    <w:p>
-      <w:pPr>
-        <w:jc w:val="center"/>
-        <w:rPr>
-          <w:rFonts w:ascii="Calibri" w:hAnsi="Calibri" w:eastAsia="Calibri" w:cs="Calibri"/>
-          <w:sz w:val="24"/>
-          <w:szCs w:val="24"/>
-        </w:rPr>
-      </w:pPr>
-      <w:r>
-        <w:rPr>
-          <w:rFonts w:ascii="Calibri" w:hAnsi="Calibri" w:eastAsia="Calibri" w:cs="Calibri"/>
-          <w:sz w:val="24"/>
-          <w:szCs w:val="24"/>
-        </w:rPr>
-        <w:drawing>
-          <wp:inline distT="114300" distB="114300" distL="114300" distR="114300">
-            <wp:extent cx="4706620" cy="2332990"/>
-            <wp:effectExtent l="0" t="0" r="17780" b="10160"/>
-            <wp:docPr id="6" name="image9.png"/>
-            <wp:cNvGraphicFramePr/>
-            <a:graphic xmlns:a="http://schemas.openxmlformats.org/drawingml/2006/main">
-              <a:graphicData uri="http://schemas.openxmlformats.org/drawingml/2006/picture">
-                <pic:pic xmlns:pic="http://schemas.openxmlformats.org/drawingml/2006/picture">
-                  <pic:nvPicPr>
-                    <pic:cNvPr id="6" name="image9.png"/>
-                    <pic:cNvPicPr preferRelativeResize="0"/>
-                  </pic:nvPicPr>
-                  <pic:blipFill>
-                    <a:blip r:embed="rId12"/>
-                    <a:srcRect/>
-                    <a:stretch>
-                      <a:fillRect/>
-                    </a:stretch>
-                  </pic:blipFill>
-                  <pic:spPr>
-                    <a:xfrm>
-                      <a:off x="0" y="0"/>
-                      <a:ext cx="4706620" cy="2332990"/>
-                    </a:xfrm>
-                    <a:prstGeom prst="rect">
-                      <a:avLst/>
-                    </a:prstGeom>
-                  </pic:spPr>
-                </pic:pic>
-              </a:graphicData>
-            </a:graphic>
-          </wp:inline>
-        </w:drawing>
-      </w:r>
-    </w:p>
-    <w:p>
-      <w:pPr>
-        <w:jc w:val="both"/>
-        <w:rPr>
-          <w:rFonts w:ascii="Calibri" w:hAnsi="Calibri" w:eastAsia="Calibri" w:cs="Calibri"/>
-          <w:sz w:val="24"/>
-          <w:szCs w:val="24"/>
-        </w:rPr>
-      </w:pPr>
-      <w:r>
-        <w:rPr>
-          <w:rFonts w:ascii="Calibri" w:hAnsi="Calibri" w:eastAsia="Calibri" w:cs="Calibri"/>
-          <w:sz w:val="24"/>
-          <w:szCs w:val="24"/>
-        </w:rPr>
-        <w:t xml:space="preserve"> </w:t>
-      </w:r>
-    </w:p>
-    <w:p>
-      <w:pPr>
-        <w:jc w:val="both"/>
-        <w:rPr>
-          <w:rFonts w:eastAsia="Calibri"/>
-          <w:szCs w:val="24"/>
-        </w:rPr>
-      </w:pPr>
-      <w:r>
-        <w:rPr>
-          <w:rFonts w:ascii="Calibri" w:hAnsi="Calibri" w:eastAsia="Calibri" w:cs="Calibri"/>
-          <w:b/>
-          <w:bCs/>
-          <w:color w:val="2E75B6"/>
-          <w:sz w:val="28"/>
-          <w:szCs w:val="28"/>
-        </w:rPr>
-        <w:t>Purpose</w:t>
-      </w:r>
-    </w:p>
-    <w:p>
-      <w:pPr>
-        <w:jc w:val="both"/>
-        <w:rPr>
-          <w:rFonts w:eastAsia="Calibri"/>
-          <w:szCs w:val="24"/>
-        </w:rPr>
-      </w:pPr>
-      <w:r>
-        <w:rPr>
-          <w:rFonts w:eastAsia="Calibri"/>
-          <w:szCs w:val="24"/>
-        </w:rPr>
-        <w:t>- Understand distribution shape:</w:t>
-      </w:r>
-    </w:p>
-    <w:p>
-      <w:pPr>
-        <w:jc w:val="both"/>
-        <w:rPr>
-          <w:rFonts w:eastAsia="Calibri"/>
-          <w:szCs w:val="24"/>
-        </w:rPr>
-      </w:pPr>
-      <w:r>
-        <w:rPr>
-          <w:rFonts w:eastAsia="Calibri"/>
-          <w:szCs w:val="24"/>
-        </w:rPr>
-        <w:t xml:space="preserve">  - typical household size range</w:t>
-      </w:r>
-    </w:p>
-    <w:p>
-      <w:pPr>
-        <w:jc w:val="both"/>
-        <w:rPr>
-          <w:rFonts w:eastAsia="Calibri"/>
-          <w:szCs w:val="24"/>
-        </w:rPr>
-      </w:pPr>
-      <w:r>
-        <w:rPr>
-          <w:rFonts w:eastAsia="Calibri"/>
-          <w:szCs w:val="24"/>
-        </w:rPr>
-        <w:t xml:space="preserve">  - spend levels</w:t>
-      </w:r>
-    </w:p>
-    <w:p>
-      <w:pPr>
-        <w:jc w:val="both"/>
-        <w:rPr>
-          <w:rFonts w:eastAsia="Calibri"/>
-          <w:szCs w:val="24"/>
-        </w:rPr>
-      </w:pPr>
-      <w:r>
-        <w:rPr>
-          <w:rFonts w:eastAsia="Calibri"/>
-          <w:szCs w:val="24"/>
-        </w:rPr>
-        <w:t xml:space="preserve">  - how far households are from already-connected households</w:t>
-      </w:r>
-    </w:p>
-    <w:p>
-      <w:pPr>
-        <w:jc w:val="both"/>
-        <w:rPr>
-          <w:rFonts w:ascii="Calibri" w:hAnsi="Calibri" w:eastAsia="Calibri" w:cs="Calibri"/>
-          <w:sz w:val="24"/>
-          <w:szCs w:val="24"/>
-        </w:rPr>
-      </w:pPr>
-      <w:r>
-        <w:rPr>
-          <w:rFonts w:ascii="Calibri" w:hAnsi="Calibri" w:eastAsia="Calibri" w:cs="Calibri"/>
-          <w:sz w:val="24"/>
-          <w:szCs w:val="24"/>
-        </w:rPr>
-        <w:t xml:space="preserve"> </w:t>
-      </w:r>
-    </w:p>
-    <w:p>
-      <w:pPr>
-        <w:jc w:val="both"/>
-        <w:rPr>
-          <w:b/>
-          <w:bCs/>
-          <w:color w:val="2E5D9E"/>
-        </w:rPr>
-      </w:pPr>
-      <w:r>
-        <w:rPr>
-          <w:b/>
-          <w:bCs/>
-          <w:color w:val="2E5D9E"/>
-        </w:rPr>
-        <w:t>Graph 6: 2D Cross-Factor Study (Heatmap)</w:t>
-      </w:r>
-    </w:p>
-    <w:p>
-      <w:pPr>
-        <w:jc w:val="both"/>
-        <w:rPr>
-          <w:rFonts w:ascii="Calibri" w:hAnsi="Calibri" w:eastAsia="Calibri" w:cs="Calibri"/>
-          <w:b/>
-          <w:bCs/>
-          <w:sz w:val="24"/>
-          <w:szCs w:val="24"/>
-        </w:rPr>
-      </w:pPr>
-    </w:p>
-    <w:p>
-      <w:pPr>
-        <w:jc w:val="center"/>
-        <w:rPr>
-          <w:rFonts w:ascii="Calibri" w:hAnsi="Calibri" w:eastAsia="Calibri" w:cs="Calibri"/>
-          <w:sz w:val="24"/>
-          <w:szCs w:val="24"/>
-        </w:rPr>
-      </w:pPr>
-      <w:r>
-        <w:rPr>
-          <w:rFonts w:ascii="Calibri" w:hAnsi="Calibri" w:eastAsia="Calibri" w:cs="Calibri"/>
-          <w:sz w:val="24"/>
-          <w:szCs w:val="24"/>
-        </w:rPr>
-        <w:drawing>
-          <wp:inline distT="114300" distB="114300" distL="114300" distR="114300">
-            <wp:extent cx="4600575" cy="2446020"/>
-            <wp:effectExtent l="0" t="0" r="9525" b="11430"/>
-            <wp:docPr id="18" name="image18.png"/>
-            <wp:cNvGraphicFramePr/>
-            <a:graphic xmlns:a="http://schemas.openxmlformats.org/drawingml/2006/main">
-              <a:graphicData uri="http://schemas.openxmlformats.org/drawingml/2006/picture">
-                <pic:pic xmlns:pic="http://schemas.openxmlformats.org/drawingml/2006/picture">
-                  <pic:nvPicPr>
-                    <pic:cNvPr id="18" name="image18.png"/>
-                    <pic:cNvPicPr preferRelativeResize="0"/>
-                  </pic:nvPicPr>
-                  <pic:blipFill>
-                    <a:blip r:embed="rId13"/>
-                    <a:srcRect/>
-                    <a:stretch>
-                      <a:fillRect/>
-                    </a:stretch>
-                  </pic:blipFill>
-                  <pic:spPr>
-                    <a:xfrm>
-                      <a:off x="0" y="0"/>
-                      <a:ext cx="4600575" cy="2446020"/>
-                    </a:xfrm>
-                    <a:prstGeom prst="rect">
-                      <a:avLst/>
-                    </a:prstGeom>
-                  </pic:spPr>
-                </pic:pic>
-              </a:graphicData>
-            </a:graphic>
-          </wp:inline>
-        </w:drawing>
-      </w:r>
-    </w:p>
-    <w:p>
-      <w:pPr>
-        <w:jc w:val="both"/>
-        <w:rPr>
-          <w:rFonts w:eastAsia="Calibri"/>
-          <w:szCs w:val="24"/>
-        </w:rPr>
-      </w:pPr>
-      <w:r>
-        <w:rPr>
-          <w:rFonts w:ascii="Calibri" w:hAnsi="Calibri" w:eastAsia="Calibri" w:cs="Calibri"/>
-          <w:sz w:val="24"/>
-          <w:szCs w:val="24"/>
-        </w:rPr>
-        <w:t xml:space="preserve"> </w:t>
-      </w:r>
-    </w:p>
-    <w:p>
-      <w:pPr>
-        <w:jc w:val="both"/>
-        <w:rPr>
-          <w:rFonts w:eastAsia="Calibri"/>
-          <w:b/>
-          <w:bCs/>
-        </w:rPr>
-      </w:pPr>
-      <w:r>
-        <w:rPr>
-          <w:rFonts w:eastAsia="Calibri"/>
-          <w:b/>
-          <w:bCs/>
-          <w:color w:val="2E75B6"/>
-        </w:rPr>
-        <w:t>What it shows</w:t>
-      </w:r>
-    </w:p>
-    <w:p>
-      <w:pPr>
-        <w:jc w:val="both"/>
-        <w:rPr>
-          <w:rFonts w:eastAsia="Calibri"/>
-        </w:rPr>
-      </w:pPr>
-      <w:r>
-        <w:rPr>
-          <w:rFonts w:eastAsia="Calibri"/>
-        </w:rPr>
-        <w:t>- % connected across two dimensions:</w:t>
-      </w:r>
-    </w:p>
-    <w:p>
-      <w:pPr>
-        <w:jc w:val="both"/>
-        <w:rPr>
-          <w:rFonts w:eastAsia="Calibri"/>
-        </w:rPr>
-      </w:pPr>
-      <w:r>
-        <w:rPr>
-          <w:rFonts w:eastAsia="Calibri"/>
-        </w:rPr>
-        <w:t xml:space="preserve">  - Cultural belt (rows)</w:t>
-      </w:r>
-    </w:p>
-    <w:p>
-      <w:pPr>
-        <w:jc w:val="both"/>
-        <w:rPr>
-          <w:rFonts w:eastAsia="Calibri"/>
-        </w:rPr>
-      </w:pPr>
-      <w:r>
-        <w:rPr>
-          <w:rFonts w:eastAsia="Calibri"/>
-        </w:rPr>
-        <w:t xml:space="preserve">  - Peri-urban/rural type (columns)</w:t>
-      </w:r>
-    </w:p>
-    <w:p>
-      <w:pPr>
-        <w:jc w:val="both"/>
-        <w:rPr>
-          <w:rFonts w:eastAsia="Calibri"/>
-        </w:rPr>
-      </w:pPr>
-      <w:r>
-        <w:rPr>
-          <w:rFonts w:eastAsia="Calibri"/>
-        </w:rPr>
-        <w:t xml:space="preserve"> </w:t>
-      </w:r>
-    </w:p>
-    <w:p>
-      <w:pPr>
-        <w:jc w:val="both"/>
-        <w:rPr>
-          <w:rFonts w:eastAsia="Calibri"/>
-          <w:b/>
-          <w:bCs/>
-        </w:rPr>
-      </w:pPr>
-      <w:r>
-        <w:rPr>
-          <w:rFonts w:eastAsia="Calibri"/>
-          <w:b/>
-          <w:bCs/>
-          <w:color w:val="2E75B6"/>
-        </w:rPr>
-        <w:t>Why it’s powerful:</w:t>
-      </w:r>
-    </w:p>
-    <w:p>
-      <w:pPr>
-        <w:jc w:val="both"/>
-        <w:rPr>
-          <w:rFonts w:eastAsia="Calibri"/>
-        </w:rPr>
-      </w:pPr>
-      <w:r>
-        <w:rPr>
-          <w:rFonts w:eastAsia="Calibri"/>
-        </w:rPr>
-        <w:t>- Instead of 1D analysis, it shows interaction effects:</w:t>
-      </w:r>
-    </w:p>
-    <w:p>
-      <w:pPr>
-        <w:jc w:val="both"/>
-        <w:rPr>
-          <w:rFonts w:eastAsia="Calibri"/>
-        </w:rPr>
-      </w:pPr>
-      <w:r>
-        <w:rPr>
-          <w:rFonts w:eastAsia="Calibri"/>
-        </w:rPr>
-        <w:t xml:space="preserve">  - Some cultural belts may be highly connected in peri-urban but not in rural areas.</w:t>
-      </w:r>
-    </w:p>
-    <w:p>
-      <w:pPr>
-        <w:spacing w:before="80" w:after="80"/>
-      </w:pPr>
-    </w:p>
-    <w:p>
-      <w:pPr>
-        <w:spacing w:before="80" w:after="80"/>
-      </w:pPr>
-    </w:p>
-    <w:p>
-      <w:pPr>
-        <w:pStyle w:val="3"/>
-      </w:pPr>
-      <w:r>
-        <w:t>5.1 Numeric Distribution Analysis</w:t>
-      </w:r>
-    </w:p>
-    <w:p>
-      <w:pPr>
-        <w:spacing w:before="60" w:after="60"/>
-        <w:jc w:val="both"/>
-      </w:pPr>
-      <w:r>
-        <w:t>Three numeric fields were analyzed for distribution shape:</w:t>
-      </w:r>
-    </w:p>
-    <w:p>
-      <w:pPr>
-        <w:pStyle w:val="21"/>
-        <w:numPr>
-          <w:ilvl w:val="0"/>
-          <w:numId w:val="1"/>
-        </w:numPr>
-        <w:spacing w:before="40" w:after="40"/>
-      </w:pPr>
-      <w:r>
-        <w:t>Household size range — understanding typical family units.</w:t>
-      </w:r>
-    </w:p>
-    <w:p>
-      <w:pPr>
-        <w:pStyle w:val="21"/>
-        <w:numPr>
-          <w:ilvl w:val="0"/>
-          <w:numId w:val="1"/>
-        </w:numPr>
-        <w:spacing w:before="40" w:after="40"/>
-      </w:pPr>
-      <w:r>
-        <w:t>Monthly electricity spend levels — capturing expenditure patterns.</w:t>
-      </w:r>
-    </w:p>
-    <w:p>
-      <w:pPr>
-        <w:pStyle w:val="21"/>
-        <w:numPr>
-          <w:ilvl w:val="0"/>
-          <w:numId w:val="1"/>
-        </w:numPr>
-        <w:spacing w:before="40" w:after="40"/>
-      </w:pPr>
-      <w:r>
-        <w:t>Distance to nearest connected household — quantifying off-grid proximity.</w:t>
-      </w:r>
-    </w:p>
-    <w:p>
-      <w:pPr>
-        <w:spacing w:before="100" w:after="100"/>
-      </w:pPr>
-    </w:p>
-    <w:p>
-      <w:pPr>
-        <w:pStyle w:val="3"/>
-      </w:pPr>
-      <w:r>
-        <w:t>5.2 2D Cross-Factor Heatmap</w:t>
-      </w:r>
-    </w:p>
-    <w:p>
-      <w:pPr>
-        <w:spacing w:before="60" w:after="60"/>
-        <w:jc w:val="both"/>
-      </w:pPr>
-      <w:r>
-        <w:t>A heatmap was constructed displaying the percentage of connected households across two simultaneous dimensions: Cultural Belt (rows) and Peri-urban / Rural type (columns). This cross-factor analysis reveals interaction effects — certain cultural belts may be highly connected in peri-urban settings but remain disconnected in rural ones — providing richer insight than any single-dimension analysis.</w:t>
-      </w:r>
-    </w:p>
     <w:p/>
     <w:p>
       <w:pPr>
         <w:pStyle w:val="2"/>
       </w:pPr>
       <w:r>
-        <w:t>6. Validation: Spark SQL vs. DataFrame</w:t>
+        <w:rPr>
+          <w:rFonts w:hint="default"/>
+          <w:lang w:val="en-US"/>
+        </w:rPr>
+        <w:t>5</w:t>
+      </w:r>
+      <w:r>
+        <w:t>. Validation: Spark SQL vs. DataFrame</w:t>
       </w:r>
     </w:p>
     <w:p>
@@ -3532,7 +2516,14 @@
         <w:pStyle w:val="3"/>
       </w:pPr>
       <w:r>
-        <w:t>6.1 Approach</w:t>
+        <w:rPr>
+          <w:rFonts w:hint="default"/>
+          <w:lang w:val="en-US"/>
+        </w:rPr>
+        <w:t>5</w:t>
+      </w:r>
+      <w:r>
+        <w:t>.1 Approach</w:t>
       </w:r>
     </w:p>
     <w:p>
@@ -3606,7 +2597,14 @@
         <w:pStyle w:val="3"/>
       </w:pPr>
       <w:r>
-        <w:t>6.2 Result</w:t>
+        <w:rPr>
+          <w:rFonts w:hint="default"/>
+          <w:lang w:val="en-US"/>
+        </w:rPr>
+        <w:t>5</w:t>
+      </w:r>
+      <w:r>
+        <w:t>.2 Result</w:t>
       </w:r>
     </w:p>
     <w:p>
@@ -3628,6 +2626,17 @@
     <w:p>
       <w:pPr>
         <w:spacing w:before="60" w:after="60"/>
+      </w:pPr>
+    </w:p>
+    <w:p>
+      <w:pPr>
+        <w:spacing w:before="60" w:after="60"/>
+        <w:jc w:val="center"/>
+        <w:rPr>
+          <w:rFonts w:ascii="Calibri" w:hAnsi="Calibri" w:eastAsia="Calibri" w:cs="Calibri"/>
+          <w:sz w:val="24"/>
+          <w:szCs w:val="24"/>
+        </w:rPr>
       </w:pPr>
     </w:p>
     <w:p>
@@ -3655,7 +2664,7 @@
                     <pic:cNvPicPr preferRelativeResize="0"/>
                   </pic:nvPicPr>
                   <pic:blipFill>
-                    <a:blip r:embed="rId14"/>
+                    <a:blip r:embed="rId9"/>
                     <a:srcRect/>
                     <a:stretch>
                       <a:fillRect/>
@@ -3701,7 +2710,7 @@
                     </pic:cNvPicPr>
                   </pic:nvPicPr>
                   <pic:blipFill>
-                    <a:blip r:embed="rId15"/>
+                    <a:blip r:embed="rId10"/>
                     <a:stretch>
                       <a:fillRect/>
                     </a:stretch>
@@ -3732,7 +2741,14 @@
         <w:pStyle w:val="2"/>
       </w:pPr>
       <w:r>
-        <w:t>7. Performance Benchmarking</w:t>
+        <w:rPr>
+          <w:rFonts w:hint="default"/>
+          <w:lang w:val="en-US"/>
+        </w:rPr>
+        <w:t>6</w:t>
+      </w:r>
+      <w:r>
+        <w:t>. Performance Benchmarking</w:t>
       </w:r>
     </w:p>
     <w:p>
@@ -3753,14 +2769,22 @@
         <w:jc w:val="both"/>
         <w:rPr>
           <w:rFonts w:hint="default"/>
-        </w:rPr>
-      </w:pPr>
-      <w:r>
+          <w:b/>
+          <w:bCs/>
+        </w:rPr>
+      </w:pPr>
+      <w:r>
+        <w:rPr>
+          <w:b/>
+          <w:bCs/>
+        </w:rPr>
         <w:t xml:space="preserve">7.1 </w:t>
       </w:r>
       <w:r>
         <w:rPr>
           <w:rFonts w:hint="default"/>
+          <w:b/>
+          <w:bCs/>
         </w:rPr>
         <w:t>Detailed Analysis: Spark SQL vs. Pure Python Performance</w:t>
       </w:r>
@@ -3795,7 +2819,7 @@
                     </pic:cNvPicPr>
                   </pic:nvPicPr>
                   <pic:blipFill>
-                    <a:blip r:embed="rId16"/>
+                    <a:blip r:embed="rId11"/>
                     <a:stretch>
                       <a:fillRect/>
                     </a:stretch>
@@ -3827,6 +2851,16 @@
           <w:rFonts w:hint="default"/>
           <w:b/>
           <w:bCs/>
+        </w:rPr>
+      </w:pPr>
+    </w:p>
+    <w:p>
+      <w:pPr>
+        <w:spacing w:before="120" w:after="120"/>
+        <w:rPr>
+          <w:rFonts w:hint="default"/>
+          <w:b/>
+          <w:bCs/>
           <w:lang w:val="en-US"/>
         </w:rPr>
       </w:pPr>
@@ -3928,20 +2962,7 @@
           <w:szCs w:val="21"/>
           <w:lang w:val="en-US"/>
         </w:rPr>
-        <w:t xml:space="preserve">Pure Python is the clear winner. It starts almost instantly and finishes the task before Spark can even finish "thinking" about how </w:t>
-      </w:r>
-      <w:bookmarkStart w:id="0" w:name="_GoBack"/>
-      <w:bookmarkEnd w:id="0"/>
-      <w:r>
-        <w:rPr>
-          <w:rFonts w:hint="default"/>
-          <w:b w:val="0"/>
-          <w:bCs w:val="0"/>
-          <w:sz w:val="21"/>
-          <w:szCs w:val="21"/>
-          <w:lang w:val="en-US"/>
-        </w:rPr>
-        <w:t>to organize the work.</w:t>
+        <w:t>Pure Python is the clear winner. It starts almost instantly and finishes the task before Spark can even finish "thinking" about how to organize the work.</w:t>
       </w:r>
     </w:p>
     <w:p>
@@ -4003,7 +3024,7 @@
                     </pic:cNvPicPr>
                   </pic:nvPicPr>
                   <pic:blipFill>
-                    <a:blip r:embed="rId17"/>
+                    <a:blip r:embed="rId12"/>
                     <a:stretch>
                       <a:fillRect/>
                     </a:stretch>
@@ -4040,6 +3061,7 @@
     <w:p>
       <w:pPr>
         <w:spacing w:before="120" w:after="120"/>
+        <w:jc w:val="both"/>
         <w:rPr>
           <w:rFonts w:hint="default"/>
           <w:b/>
@@ -4064,6 +3086,7 @@
     <w:p>
       <w:pPr>
         <w:spacing w:before="120" w:after="120"/>
+        <w:jc w:val="both"/>
         <w:rPr>
           <w:rFonts w:hint="default"/>
           <w:b w:val="0"/>
@@ -4099,6 +3122,7 @@
     <w:p>
       <w:pPr>
         <w:spacing w:before="120" w:after="120"/>
+        <w:jc w:val="both"/>
         <w:rPr>
           <w:rFonts w:hint="default"/>
           <w:b w:val="0"/>
@@ -4134,6 +3158,7 @@
     <w:p>
       <w:pPr>
         <w:spacing w:before="120" w:after="120"/>
+        <w:jc w:val="both"/>
         <w:rPr>
           <w:rFonts w:hint="default"/>
           <w:b w:val="0"/>
@@ -4169,6 +3194,7 @@
     <w:p>
       <w:pPr>
         <w:spacing w:before="120" w:after="120"/>
+        <w:jc w:val="both"/>
         <w:rPr>
           <w:rFonts w:hint="default"/>
           <w:b w:val="0"/>
@@ -4204,6 +3230,7 @@
     <w:p>
       <w:pPr>
         <w:spacing w:before="120" w:after="120"/>
+        <w:jc w:val="both"/>
         <w:rPr>
           <w:rFonts w:hint="default"/>
           <w:b w:val="0"/>
@@ -4239,6 +3266,7 @@
     <w:p>
       <w:pPr>
         <w:spacing w:before="120" w:after="120"/>
+        <w:jc w:val="both"/>
         <w:rPr>
           <w:rFonts w:hint="default"/>
           <w:b w:val="0"/>
@@ -4274,6 +3302,7 @@
     <w:p>
       <w:pPr>
         <w:spacing w:before="120" w:after="120"/>
+        <w:jc w:val="both"/>
         <w:rPr>
           <w:rFonts w:hint="default"/>
           <w:b w:val="0"/>
@@ -4287,6 +3316,7 @@
     <w:p>
       <w:pPr>
         <w:spacing w:before="120" w:after="120"/>
+        <w:jc w:val="both"/>
         <w:rPr>
           <w:rFonts w:hint="default"/>
           <w:b w:val="0"/>
@@ -4326,7 +3356,14 @@
         <w:pStyle w:val="3"/>
       </w:pPr>
       <w:r>
-        <w:t>7.2 Results Summary</w:t>
+        <w:rPr>
+          <w:rFonts w:hint="default"/>
+          <w:lang w:val="en-US"/>
+        </w:rPr>
+        <w:t>6</w:t>
+      </w:r>
+      <w:r>
+        <w:t>.2 Results Summary</w:t>
       </w:r>
     </w:p>
     <w:p>
@@ -4804,7 +3841,14 @@
         <w:pStyle w:val="2"/>
       </w:pPr>
       <w:r>
-        <w:t>8. Results Summary</w:t>
+        <w:rPr>
+          <w:rFonts w:hint="default"/>
+          <w:lang w:val="en-US"/>
+        </w:rPr>
+        <w:t>7</w:t>
+      </w:r>
+      <w:r>
+        <w:t>. Results Summary</w:t>
       </w:r>
     </w:p>
     <w:p>
@@ -4836,6 +3880,7 @@
           <w:numId w:val="1"/>
         </w:numPr>
         <w:spacing w:before="40" w:after="40"/>
+        <w:jc w:val="both"/>
       </w:pPr>
       <w:r>
         <w:t>Constructed a scalable PySpark ETL pipeline capable of processing large household survey datasets.</w:t>
@@ -4849,6 +3894,7 @@
           <w:numId w:val="1"/>
         </w:numPr>
         <w:spacing w:before="40" w:after="40"/>
+        <w:jc w:val="both"/>
       </w:pPr>
       <w:r>
         <w:t>Validated correctness: Spark SQL and DataFrame APIs produce consistent aggregation results.</w:t>
@@ -4862,6 +3908,7 @@
           <w:numId w:val="1"/>
         </w:numPr>
         <w:spacing w:before="40" w:after="40"/>
+        <w:jc w:val="both"/>
       </w:pPr>
       <w:r>
         <w:t>Generated six unique analytical visualizations covering coverage, equity, connection rates, numeric distributions, 2D cross-factor studies, and infrastructure barriers.</w:t>
@@ -4875,6 +3922,7 @@
           <w:numId w:val="1"/>
         </w:numPr>
         <w:spacing w:before="40" w:after="40"/>
+        <w:jc w:val="both"/>
       </w:pPr>
       <w:r>
         <w:t>Enforced strict data filtering to eliminate NULL, UNKNOWN, and empty label artifacts.</w:t>
@@ -4888,6 +3936,7 @@
           <w:numId w:val="1"/>
         </w:numPr>
         <w:spacing w:before="40" w:after="40"/>
+        <w:jc w:val="both"/>
       </w:pPr>
       <w:r>
         <w:t>Exported all visualizations as JPG files for consistent submission and portability.</w:t>
@@ -4903,7 +3952,14 @@
         <w:pStyle w:val="2"/>
       </w:pPr>
       <w:r>
-        <w:t>9. Conclusion</w:t>
+        <w:rPr>
+          <w:rFonts w:hint="default"/>
+          <w:lang w:val="en-US"/>
+        </w:rPr>
+        <w:t>8</w:t>
+      </w:r>
+      <w:r>
+        <w:t>. Conclusion</w:t>
       </w:r>
     </w:p>
     <w:p>
@@ -4935,6 +3991,7 @@
           <w:numId w:val="1"/>
         </w:numPr>
         <w:spacing w:before="40" w:after="40"/>
+        <w:jc w:val="both"/>
       </w:pPr>
       <w:r>
         <w:t>Spark enables efficient ETL at scale with multiple parallel analysis pipelines.</w:t>
@@ -4948,6 +4005,7 @@
           <w:numId w:val="1"/>
         </w:numPr>
         <w:spacing w:before="40" w:after="40"/>
+        <w:jc w:val="both"/>
       </w:pPr>
       <w:r>
         <w:t>SQL and DataFrame interfaces yield equivalent results, providing flexibility without sacrificing correctness.</w:t>
@@ -4961,6 +4019,7 @@
           <w:numId w:val="1"/>
         </w:numPr>
         <w:spacing w:before="40" w:after="40"/>
+        <w:jc w:val="both"/>
       </w:pPr>
       <w:r>
         <w:t>Strict data cleaning rules materially improve the quality and interpretability of visual outputs.</w:t>
@@ -4974,6 +4033,7 @@
           <w:numId w:val="1"/>
         </w:numPr>
         <w:spacing w:before="40" w:after="40"/>
+        <w:jc w:val="both"/>
       </w:pPr>
       <w:r>
         <w:t>Visual analytics provide evidence-based insights into energy access distribution across regions and districts, inequality factors (SEC category, rural/urban classification, education), and potential infrastructure barriers (distance, reasons for non-connection).</w:t>
@@ -4982,6 +4042,7 @@
     <w:p>
       <w:pPr>
         <w:spacing w:before="80" w:after="80"/>
+        <w:jc w:val="both"/>
       </w:pPr>
     </w:p>
     <w:p>
@@ -5002,6 +4063,12 @@
       <w:footerReference r:id="rId4" w:type="default"/>
       <w:pgSz w:w="12240" w:h="15840"/>
       <w:pgMar w:top="1080" w:right="1080" w:bottom="1080" w:left="1080" w:header="708" w:footer="708" w:gutter="0"/>
+      <w:pgBorders>
+        <w:top w:val="none" w:sz="0" w:space="0"/>
+        <w:left w:val="none" w:sz="0" w:space="0"/>
+        <w:bottom w:val="none" w:sz="0" w:space="0"/>
+        <w:right w:val="none" w:sz="0" w:space="0"/>
+      </w:pgBorders>
       <w:cols w:space="720" w:num="1"/>
       <w:docGrid w:linePitch="360" w:charSpace="0"/>
     </w:sectPr>

</xml_diff>